<commit_message>
A2.2: corregeix l'exercici 3 (mdadm) i el pas 6 de la pràctica LVM, comprovats a Ubuntu 26.04
- Ex. 3: dispositius loop amb losetup --show (a l'escriptori els primers loop són dels snaps) i disc de recanvi propi (disk4.img) al pas 5.
- Part 1, pas 6: elimina la instantània abans d'ampliar el volum (si no, lvextend falla).

Co-Authored-By: Claude Opus 5.5 <noreply@anthropic.com>
Claude-Session: https://claude.ai/code/session_01BodJZ9PsepvknsFhsdyYkP
</commit_message>
<xml_diff>
--- a/RA2 - Emmagatzematge i copies de seguretat/AA2 - Sistemes demmagatzematge/A2.2_Activitats_Sistemes_emmagatzematge.docx
+++ b/RA2 - Emmagatzematge i copies de seguretat/AA2 - Sistemes demmagatzematge/A2.2_Activitats_Sistemes_emmagatzematge.docx
@@ -1090,7 +1090,7 @@
                 <w:szCs w:val="20"/>
                 <w:rtl w:val="0"/>
               </w:rPr>
-              <w:t xml:space="preserve">Pràctica guiada: munta un RAID 5 per programari amb mdadm (Linux) sobre 3 discos (poden ser discs virtuals/loop, com als passos següents, o particions reals si treballes en una màquina de proves). Segueix cada pas, executa exactament les ordres indicades al terminal, i adjunta una captura de pantalla real de cada pas assenyalat amb [CAPTURA]. Si treballes en un ordinador de l'aula sense discos addicionals disponibles, pots crear tres fitxers d'imatge de 200 MB i muntar-los com a dispositius de bucle (loop), tal com es mostra al pas 1.</w:t>
+              <w:t xml:space="preserve">Pràctica guiada: munta un RAID 5 per programari amb mdadm (Linux) sobre 3 discos (poden ser discs virtuals/loop, com als passos següents, o particions reals si treballes en una màquina de proves). Segueix cada pas, executa exactament les ordres indicades al terminal, i adjunta una captura de pantalla real de cada pas assenyalat amb [CAPTURA]. Si treballes en un ordinador de l'aula sense discos addicionals disponibles, pots crear fitxers d'imatge de 200 MB i associar-los a dispositius de bucle (loop), tal com es mostra al pas 1.</w:t>
             </w:r>
           </w:p>
           <w:p>
@@ -1119,7 +1119,7 @@
                 <w:szCs w:val="20"/>
                 <w:rtl w:val="0"/>
               </w:rPr>
-              <w:t xml:space="preserve">Obre un terminal com a superusuari i crea tres fitxers d'imatge que faran de "discos" de prova, i associa'ls a dispositius de bucle. [CAPTURA]</w:t>
+              <w:t xml:space="preserve">Obre un terminal com a superusuari i crea quatre fitxers d'imatge que faran de "discos" de prova (tres per a l'array i un de recanvi per al pas 5). Associa els tres primers a dispositius de bucle (loop): cada ordre desa el nom del dispositiu a les variables D1, D2 i D3 i el mostra per pantalla. A Ubuntu d'escriptori, els primers dispositius loop ja els fan servir els paquets snap, per això no es poden escriure noms fixos com /dev/loop0. No tanquis el terminal fins al final: les variables només existeixen en aquesta sessió. [CAPTURA]</w:t>
             </w:r>
           </w:p>
           <w:p>
@@ -1164,19 +1164,43 @@
                 <w:sz w:val="19"/>
                 <w:szCs w:val="19"/>
               </w:rPr>
-              <w:t xml:space="preserve"># for i in 1 2 3; do dd if=/dev/zero of=disk$i.img bs=1M count=200; done</w:t>
-            </w:r>
-            <w:r>
-              <w:br/>
-              <w:t xml:space="preserve"/>
-            </w:r>
-            <w:r>
-              <w:rPr>
-                <w:rFonts w:ascii="Consolas" w:cs="Consolas" w:eastAsia="Consolas" w:hAnsi="Consolas"/>
-                <w:sz w:val="19"/>
-                <w:szCs w:val="19"/>
-              </w:rPr>
-              <w:t xml:space="preserve"># losetup -fP disk1.img &amp;&amp; losetup -fP disk2.img &amp;&amp; losetup -fP disk3.img</w:t>
+              <w:t xml:space="preserve"># for i in 1 2 3 4; do dd if=/dev/zero of=disk$i.img bs=1M count=200; done</w:t>
+            </w:r>
+            <w:r>
+              <w:br/>
+              <w:t xml:space="preserve"/>
+            </w:r>
+            <w:r>
+              <w:rPr>
+                <w:rFonts w:ascii="Consolas" w:cs="Consolas" w:eastAsia="Consolas" w:hAnsi="Consolas"/>
+                <w:sz w:val="19"/>
+                <w:szCs w:val="19"/>
+              </w:rPr>
+              <w:t xml:space="preserve"># D1=$(losetup -f --show disk1.img); echo $D1</w:t>
+            </w:r>
+            <w:r>
+              <w:br/>
+              <w:t xml:space="preserve"/>
+            </w:r>
+            <w:r>
+              <w:rPr>
+                <w:rFonts w:ascii="Consolas" w:cs="Consolas" w:eastAsia="Consolas" w:hAnsi="Consolas"/>
+                <w:sz w:val="19"/>
+                <w:szCs w:val="19"/>
+              </w:rPr>
+              <w:t xml:space="preserve"># D2=$(losetup -f --show disk2.img); echo $D2</w:t>
+            </w:r>
+            <w:r>
+              <w:br/>
+              <w:t xml:space="preserve"/>
+            </w:r>
+            <w:r>
+              <w:rPr>
+                <w:rFonts w:ascii="Consolas" w:cs="Consolas" w:eastAsia="Consolas" w:hAnsi="Consolas"/>
+                <w:sz w:val="19"/>
+                <w:szCs w:val="19"/>
+              </w:rPr>
+              <w:t xml:space="preserve"># D3=$(losetup -f --show disk3.img); echo $D3</w:t>
             </w:r>
             <w:r>
               <w:br/>
@@ -1217,7 +1241,7 @@
                 <w:szCs w:val="20"/>
                 <w:rtl w:val="0"/>
               </w:rPr>
-              <w:t xml:space="preserve">Instal·la mdadm si no el tens i crea l'array RAID 5 amb els tres dispositius. [CAPTURA]</w:t>
+              <w:t xml:space="preserve">Instal·la mdadm si no el tens i crea l'array RAID 5 amb els tres dispositius. Si mdadm et pregunta si vols activar el write-intent bitmap, pots respondre N (l'opció per defecte). [CAPTURA]</w:t>
             </w:r>
           </w:p>
           <w:p>
@@ -1250,7 +1274,7 @@
                 <w:sz w:val="19"/>
                 <w:szCs w:val="19"/>
               </w:rPr>
-              <w:t xml:space="preserve"># mdadm --create /dev/md0 --level=5 --raid-devices=3 /dev/loop0 /dev/loop1 /dev/loop2</w:t>
+              <w:t xml:space="preserve"># mdadm --create /dev/md0 --level=5 --raid-devices=3 $D1 $D2 $D3</w:t>
             </w:r>
             <w:r>
               <w:br/>
@@ -1429,7 +1453,7 @@
                 <w:sz w:val="19"/>
                 <w:szCs w:val="19"/>
               </w:rPr>
-              <w:t xml:space="preserve"># mdadm /dev/md0 --fail /dev/loop1</w:t>
+              <w:t xml:space="preserve"># mdadm /dev/md0 --fail $D2</w:t>
             </w:r>
             <w:r>
               <w:br/>
@@ -1501,7 +1525,7 @@
                 <w:szCs w:val="20"/>
                 <w:rtl w:val="0"/>
               </w:rPr>
-              <w:t xml:space="preserve">Substitueix el disc fallat per un de nou i deixa que l'array es reconstrueixi (rebuild). [CAPTURA]</w:t>
+              <w:t xml:space="preserve">Treu el disc fallat, connecta el disc de recanvi (disk4.img) i deixa que l'array es reconstrueixi (rebuild). [CAPTURA]</w:t>
             </w:r>
           </w:p>
           <w:p>
@@ -1522,31 +1546,31 @@
                 <w:sz w:val="19"/>
                 <w:szCs w:val="19"/>
               </w:rPr>
-              <w:t xml:space="preserve"># mdadm /dev/md0 --remove /dev/loop1</w:t>
-            </w:r>
-            <w:r>
-              <w:br/>
-              <w:t xml:space="preserve"/>
-            </w:r>
-            <w:r>
-              <w:rPr>
-                <w:rFonts w:ascii="Consolas" w:cs="Consolas" w:eastAsia="Consolas" w:hAnsi="Consolas"/>
-                <w:sz w:val="19"/>
-                <w:szCs w:val="19"/>
-              </w:rPr>
-              <w:t xml:space="preserve"># losetup -fP disk1.img   # (simula connectar un disc de recanvi; ajusta el nom si cal)</w:t>
-            </w:r>
-            <w:r>
-              <w:br/>
-              <w:t xml:space="preserve"/>
-            </w:r>
-            <w:r>
-              <w:rPr>
-                <w:rFonts w:ascii="Consolas" w:cs="Consolas" w:eastAsia="Consolas" w:hAnsi="Consolas"/>
-                <w:sz w:val="19"/>
-                <w:szCs w:val="19"/>
-              </w:rPr>
-              <w:t xml:space="preserve"># mdadm /dev/md0 --add /dev/loop3</w:t>
+              <w:t xml:space="preserve"># mdadm /dev/md0 --remove $D2</w:t>
+            </w:r>
+            <w:r>
+              <w:br/>
+              <w:t xml:space="preserve"/>
+            </w:r>
+            <w:r>
+              <w:rPr>
+                <w:rFonts w:ascii="Consolas" w:cs="Consolas" w:eastAsia="Consolas" w:hAnsi="Consolas"/>
+                <w:sz w:val="19"/>
+                <w:szCs w:val="19"/>
+              </w:rPr>
+              <w:t xml:space="preserve"># D4=$(losetup -f --show disk4.img); echo $D4</w:t>
+            </w:r>
+            <w:r>
+              <w:br/>
+              <w:t xml:space="preserve"/>
+            </w:r>
+            <w:r>
+              <w:rPr>
+                <w:rFonts w:ascii="Consolas" w:cs="Consolas" w:eastAsia="Consolas" w:hAnsi="Consolas"/>
+                <w:sz w:val="19"/>
+                <w:szCs w:val="19"/>
+              </w:rPr>
+              <w:t xml:space="preserve"># mdadm /dev/md0 --add $D4</w:t>
             </w:r>
             <w:r>
               <w:br/>
@@ -3843,7 +3867,7 @@
                 <w:szCs w:val="20"/>
                 <w:rtl w:val="0"/>
               </w:rPr>
-              <w:t xml:space="preserve">Demostra l'escalabilitat: amplia (extend) el volum lògic lv_documents fent servir l'espai lliure restant del grup, i redimensiona el sistema de fitxers perquè n'aprofiti tot l'espai. [CAPTURA]</w:t>
+              <w:t xml:space="preserve">Demostra l'escalabilitat: amplia (extend) el volum lògic lv_documents fent servir l'espai lliure restant del grup, i redimensiona el sistema de fitxers perquè n'aprofiti tot l'espai. Abans, desmunta i elimina la instantània del pas 5 (respon y quan lvremove et demani confirmació): LVM no permet ampliar un volum que té una instantània activa. [CAPTURA]</w:t>
             </w:r>
           </w:p>
           <w:p>
@@ -3858,6 +3882,30 @@
               <w:spacing w:after="160" w:before="80"/>
               <w:jc w:val="left"/>
             </w:pPr>
+            <w:r>
+              <w:rPr>
+                <w:rFonts w:ascii="Consolas" w:cs="Consolas" w:eastAsia="Consolas" w:hAnsi="Consolas"/>
+                <w:sz w:val="19"/>
+                <w:szCs w:val="19"/>
+              </w:rPr>
+              <w:t xml:space="preserve"># umount /mnt/snap</w:t>
+            </w:r>
+            <w:r>
+              <w:br/>
+              <w:t xml:space="preserve"/>
+            </w:r>
+            <w:r>
+              <w:rPr>
+                <w:rFonts w:ascii="Consolas" w:cs="Consolas" w:eastAsia="Consolas" w:hAnsi="Consolas"/>
+                <w:sz w:val="19"/>
+                <w:szCs w:val="19"/>
+              </w:rPr>
+              <w:t xml:space="preserve"># lvremove /dev/vg_dades/lv_documents_snap</w:t>
+            </w:r>
+            <w:r>
+              <w:br/>
+              <w:t xml:space="preserve"/>
+            </w:r>
             <w:r>
               <w:rPr>
                 <w:rFonts w:ascii="Consolas" w:cs="Consolas" w:eastAsia="Consolas" w:hAnsi="Consolas"/>

</xml_diff>

<commit_message>
RA2: recerca de proveïdors de núvol, cron per objectius, còpia remota amb Restic i exposició A2.4
- A2.2: l'exercici 4 passa a ser una recerca en grup de proveïdors de núvol; la Part 2 (Windows) és opcional.
- A2.3: pas 7 de cron per objectius, Part 3 nova (servidor de còpies a IsardVDI amb Restic per SFTP) i Part 1 (Duplicati) opcional.
- A2.4: enunciat i rúbrica de l'exposició sobre programari lliure de còpies de seguretat.

Co-Authored-By: Claude Opus 5.5 <noreply@anthropic.com>
Claude-Session: https://claude.ai/code/session_01BodJZ9PsepvknsFhsdyYkP
</commit_message>
<xml_diff>
--- a/RA2 - Emmagatzematge i copies de seguretat/AA2 - Sistemes demmagatzematge/A2.2_Activitats_Sistemes_emmagatzematge.docx
+++ b/RA2 - Emmagatzematge i copies de seguretat/AA2 - Sistemes demmagatzematge/A2.2_Activitats_Sistemes_emmagatzematge.docx
@@ -540,7 +540,7 @@
                 <w:szCs w:val="20"/>
                 <w:rtl w:val="0"/>
               </w:rPr>
-              <w:t xml:space="preserve">Treballeu com a tècnics de Puig Castellar Tech, la consultoria informàtica simulada del cicle SMX de l'Institut Puig Castellar. Un client, un despatx d'advocats amb dades molt sensibles, us demana dissenyar i documentar DUES solucions d'emmagatzematge —una per a servidors Linux (LVM) i una per a servidors Windows (espais d'emmagatzematge / Storage Spaces)— que compleixin els principis d'alta disponibilitat, redundància i escalabilitat, sense interrompre mai el servei.</w:t>
+              <w:t xml:space="preserve">Treballeu com a tècnics de Puig Castellar Tech, la consultoria informàtica simulada del cicle SMX de l'Institut Puig Castellar. Un client, un despatx d'advocats amb dades molt sensibles, us demana dissenyar i documentar DUES solucions d'emmagatzematge —una per a servidors Linux (LVM) i una per a servidors Windows (espais d'emmagatzematge / Storage Spaces)— que compleixin els principis d'alta disponibilitat, redundància i escalabilitat, sense interrompre mai el servei. La Part 2 (Windows) és una ampliació opcional.</w:t>
             </w:r>
           </w:p>
           <w:p>
@@ -1677,7 +1677,7 @@
                 <w:rFonts w:ascii="Verdana" w:cs="Verdana" w:eastAsia="Verdana" w:hAnsi="Verdana"/>
                 <w:rtl w:val="0"/>
               </w:rPr>
-              <w:t xml:space="preserve">Enunciat exercici 4</w:t>
+              <w:t xml:space="preserve">Enunciat exercici 4 · Recerca en grup: proveïdors de núvol</w:t>
             </w:r>
           </w:p>
         </w:tc>
@@ -1700,20 +1700,68 @@
           <w:p>
             <w:pPr>
               <w:widowControl w:val="1"/>
-              <w:spacing w:line="240" w:lineRule="auto" w:after="0" w:before="0"/>
-              <w:rPr>
-                <w:color w:val="1155cc"/>
-                <w:sz w:val="20"/>
-                <w:szCs w:val="20"/>
-              </w:rPr>
-            </w:pPr>
-            <w:r>
-              <w:rPr>
-                <w:sz w:val="20"/>
-                <w:szCs w:val="20"/>
-                <w:rtl w:val="0"/>
-              </w:rPr>
-              <w:t xml:space="preserve">Compara dos serveis reals d'emmagatzematge al núvol (per exemple, Google Drive/Workspace, Microsoft OneDrive, Amazon S3 o Backblaze B2). Per a cadascun, indica:</w:t>
+              <w:spacing w:line="240" w:lineRule="auto" w:after="100"/>
+              <w:rPr>
+                <w:color w:val="1155cc"/>
+                <w:sz w:val="20"/>
+                <w:szCs w:val="20"/>
+              </w:rPr>
+            </w:pPr>
+            <w:r>
+              <w:rPr>
+                <w:sz w:val="20"/>
+                <w:szCs w:val="20"/>
+                <w:rtl w:val="0"/>
+              </w:rPr>
+              <w:t xml:space="preserve">Treball de recerca en grups de 2 o 3 persones. Puig Castellar Tech vol recomanar un servei d'emmagatzematge al núvol als seus clients i us encarrega una comparativa.</w:t>
+            </w:r>
+          </w:p>
+          <w:p>
+            <w:pPr>
+              <w:widowControl w:val="1"/>
+              <w:spacing w:line="240" w:lineRule="auto" w:after="100"/>
+              <w:rPr>
+                <w:color w:val="1155cc"/>
+                <w:sz w:val="20"/>
+                <w:szCs w:val="20"/>
+              </w:rPr>
+            </w:pPr>
+            <w:r>
+              <w:rPr>
+                <w:b/>
+                <w:sz w:val="20"/>
+                <w:szCs w:val="20"/>
+                <w:rtl w:val="0"/>
+              </w:rPr>
+              <w:t xml:space="preserve">Objectiu: </w:t>
+            </w:r>
+            <w:r>
+              <w:rPr>
+                <w:sz w:val="20"/>
+                <w:szCs w:val="20"/>
+                <w:rtl w:val="0"/>
+              </w:rPr>
+              <w:t xml:space="preserve">comparar com a mínim quatre proveïdors: dos pensats per a usuaris i petites empreses (per exemple, Google Drive, Microsoft OneDrive, Dropbox, pCloud, MEGA o Proton Drive) i dos d'emmagatzematge per a còpies de seguretat o objectes (per exemple, Backblaze B2, Amazon S3, Wasabi o Hetzner Storage Box).</w:t>
+            </w:r>
+          </w:p>
+          <w:p>
+            <w:pPr>
+              <w:widowControl w:val="1"/>
+              <w:spacing w:line="240" w:lineRule="auto" w:after="100"/>
+              <w:rPr>
+                <w:color w:val="1155cc"/>
+                <w:sz w:val="20"/>
+                <w:szCs w:val="20"/>
+              </w:rPr>
+            </w:pPr>
+            <w:r>
+              <w:rPr>
+                <w:b/>
+                <w:sz w:val="20"/>
+                <w:szCs w:val="20"/>
+                <w:rtl w:val="0"/>
+              </w:rPr>
+              <w:t xml:space="preserve">La comparativa ha d'incloure: </w:t>
             </w:r>
           </w:p>
           <w:p>
@@ -1729,7 +1777,6 @@
             </w:pPr>
             <w:r>
               <w:rPr>
-                <w:bCs/>
                 <w:b/>
                 <w:sz w:val="20"/>
                 <w:szCs w:val="20"/>
@@ -1743,7 +1790,7 @@
                 <w:szCs w:val="20"/>
                 <w:rtl w:val="0"/>
               </w:rPr>
-              <w:t xml:space="preserve">quin pla gratuït (si n'hi ha) ofereixen;</w:t>
+              <w:t xml:space="preserve">Funcionalitats: sincronització, historial de versions, paperera i temps per recuperar fitxers, compartició d'enllaços i xifratge (en trànsit, en repòs i d'extrem a extrem).</w:t>
             </w:r>
           </w:p>
           <w:p>
@@ -1759,7 +1806,6 @@
             </w:pPr>
             <w:r>
               <w:rPr>
-                <w:bCs/>
                 <w:b/>
                 <w:sz w:val="20"/>
                 <w:szCs w:val="20"/>
@@ -1773,13 +1819,13 @@
                 <w:szCs w:val="20"/>
                 <w:rtl w:val="0"/>
               </w:rPr>
-              <w:t xml:space="preserve">com descriuen la redundància/replicació de les dades a la seva documentació tècnica;</w:t>
-            </w:r>
-          </w:p>
-          <w:p>
-            <w:pPr>
-              <w:widowControl w:val="1"/>
-              <w:spacing w:line="240" w:lineRule="auto" w:after="100" w:before="100"/>
+              <w:t xml:space="preserve">Preus: pla gratuït (si n'hi ha) i preu anual per a 1 TB i per a 2 TB, amb els costos addicionals (descàrregues, peticions).</w:t>
+            </w:r>
+          </w:p>
+          <w:p>
+            <w:pPr>
+              <w:widowControl w:val="1"/>
+              <w:spacing w:line="240" w:lineRule="auto" w:after="0" w:before="100"/>
               <w:ind w:left="340" w:hanging="340"/>
               <w:rPr>
                 <w:color w:val="1155cc"/>
@@ -1789,7 +1835,6 @@
             </w:pPr>
             <w:r>
               <w:rPr>
-                <w:bCs/>
                 <w:b/>
                 <w:sz w:val="20"/>
                 <w:szCs w:val="20"/>
@@ -1803,7 +1848,121 @@
                 <w:szCs w:val="20"/>
                 <w:rtl w:val="0"/>
               </w:rPr>
-              <w:t xml:space="preserve">el preu aproximat per emmagatzemar 1 TB durant un any. Acaba comentant un risc legal (relacionat amb el RGPD) que cal tenir en compte si les dades emmagatzemades inclouen dades personals de clients.</w:t>
+              <w:t xml:space="preserve">Accés: client d'escriptori (Windows, macOS i Linux), web i mòbil, i si permet fer còpies de seguretat automàtiques o només sincronitzar.</w:t>
+            </w:r>
+          </w:p>
+          <w:p>
+            <w:pPr>
+              <w:widowControl w:val="1"/>
+              <w:spacing w:line="240" w:lineRule="auto" w:after="0" w:before="100"/>
+              <w:ind w:left="340" w:hanging="340"/>
+              <w:rPr>
+                <w:color w:val="1155cc"/>
+                <w:sz w:val="20"/>
+                <w:szCs w:val="20"/>
+              </w:rPr>
+            </w:pPr>
+            <w:r>
+              <w:rPr>
+                <w:b/>
+                <w:sz w:val="20"/>
+                <w:szCs w:val="20"/>
+                <w:rtl w:val="0"/>
+              </w:rPr>
+              <w:t xml:space="preserve">d) </w:t>
+            </w:r>
+            <w:r>
+              <w:rPr>
+                <w:sz w:val="20"/>
+                <w:szCs w:val="20"/>
+                <w:rtl w:val="0"/>
+              </w:rPr>
+              <w:t xml:space="preserve">Redundància i ubicació: com protegeix les dades (rèpliques, centres de dades) i en quins països les guarda.</w:t>
+            </w:r>
+          </w:p>
+          <w:p>
+            <w:pPr>
+              <w:widowControl w:val="1"/>
+              <w:spacing w:line="240" w:lineRule="auto" w:after="0" w:before="100"/>
+              <w:ind w:left="340" w:hanging="340"/>
+              <w:rPr>
+                <w:color w:val="1155cc"/>
+                <w:sz w:val="20"/>
+                <w:szCs w:val="20"/>
+              </w:rPr>
+            </w:pPr>
+            <w:r>
+              <w:rPr>
+                <w:b/>
+                <w:sz w:val="20"/>
+                <w:szCs w:val="20"/>
+                <w:rtl w:val="0"/>
+              </w:rPr>
+              <w:t xml:space="preserve">e) </w:t>
+            </w:r>
+            <w:r>
+              <w:rPr>
+                <w:sz w:val="20"/>
+                <w:szCs w:val="20"/>
+                <w:rtl w:val="0"/>
+              </w:rPr>
+              <w:t xml:space="preserve">RGPD: si es pot triar una regió de la UE i si el proveïdor ofereix un contracte d'encarregat del tractament.</w:t>
+            </w:r>
+          </w:p>
+          <w:p>
+            <w:pPr>
+              <w:widowControl w:val="1"/>
+              <w:spacing w:line="240" w:lineRule="auto" w:after="100"/>
+              <w:rPr>
+                <w:color w:val="1155cc"/>
+                <w:sz w:val="20"/>
+                <w:szCs w:val="20"/>
+              </w:rPr>
+            </w:pPr>
+            <w:r>
+              <w:rPr>
+                <w:b/>
+                <w:sz w:val="20"/>
+                <w:szCs w:val="20"/>
+                <w:rtl w:val="0"/>
+              </w:rPr>
+              <w:t xml:space="preserve">Lliurable: </w:t>
+            </w:r>
+            <w:r>
+              <w:rPr>
+                <w:sz w:val="20"/>
+                <w:szCs w:val="20"/>
+                <w:rtl w:val="0"/>
+              </w:rPr>
+              <w:t xml:space="preserve">una taula comparativa amb les fonts consultades i la data de consulta (els preus canvien sovint), i una recomanació justificada (mitja pàgina) per a l'empresa ArquiDigital S.L. de l'exercici 6.</w:t>
+            </w:r>
+          </w:p>
+          <w:p>
+            <w:pPr>
+              <w:widowControl w:val="1"/>
+              <w:spacing w:line="240" w:lineRule="auto" w:after="100"/>
+              <w:rPr>
+                <w:color w:val="1155cc"/>
+                <w:sz w:val="20"/>
+                <w:szCs w:val="20"/>
+              </w:rPr>
+            </w:pPr>
+            <w:r>
+              <w:rPr>
+                <w:b/>
+                <w:sz w:val="20"/>
+                <w:szCs w:val="20"/>
+                <w:rtl w:val="0"/>
+              </w:rPr>
+              <w:t xml:space="preserve">Per pensar: </w:t>
+            </w:r>
+            <w:r>
+              <w:rPr>
+                <w:sz w:val="20"/>
+                <w:szCs w:val="20"/>
+                <w:rtl w:val="0"/>
+              </w:rPr>
+              <w:t xml:space="preserve">per què sincronitzar una carpeta amb el núvol no és el mateix que fer-ne una còpia de seguretat? Què passaria si un ransomware xifrés els fitxers d'una carpeta sincronitzada?</w:t>
             </w:r>
           </w:p>
         </w:tc>
@@ -3934,7 +4093,7 @@
                 <w:rFonts w:ascii="Verdana" w:cs="Verdana" w:eastAsia="Verdana" w:hAnsi="Verdana"/>
                 <w:rtl w:val="0"/>
               </w:rPr>
-              <w:t xml:space="preserve">Pràctica guiada · Part 2 · Windows: espais d'emmagatzematge (Storage Spaces)</w:t>
+              <w:t xml:space="preserve">Pràctica guiada · Part 2 · Windows: espais d'emmagatzematge (ampliació opcional)</w:t>
             </w:r>
           </w:p>
         </w:tc>
@@ -4316,7 +4475,7 @@
                 <w:szCs w:val="20"/>
                 <w:rtl w:val="0"/>
               </w:rPr>
-              <w:t xml:space="preserve">Redacta un informe breu (mitja pàgina) adreçat al client (el despatx d'advocats) comparant les dues solucions implementades (LVM a Linux i Storage Spaces a Windows): quina recomanaries per al seu servidor de documents principal, tenint en compte que necessiten poder ampliar l'espai en el futur sense aturar mai el servei, i per què.</w:t>
+              <w:t xml:space="preserve">Redacta un informe breu (mitja pàgina) adreçat al client (el despatx d'advocats) comparant les dues solucions (LVM a Linux i Storage Spaces a Windows; si no has fet la Part 2, basa't en el temari i en la documentació de Microsoft): quina recomanaries per al seu servidor de documents principal, tenint en compte que necessiten poder ampliar l'espai en el futur sense aturar mai el servei, i per què.</w:t>
             </w:r>
           </w:p>
         </w:tc>

</xml_diff>